<commit_message>
added submittal number in coversheet
</commit_message>
<xml_diff>
--- a/templates/Coverpage_New.docx
+++ b/templates/Coverpage_New.docx
@@ -299,21 +299,12 @@
                   <w:tcW w:w="715" w:type="dxa"/>
                 </w:tcPr>
                 <w:p>
-                  <w:proofErr w:type="spellStart"/>
                   <w:r>
                     <w:rPr>
                       <w:b/>
                       <w:bCs/>
                     </w:rPr>
-                    <w:t>Contr</w:t>
-                  </w:r>
-                  <w:proofErr w:type="spellEnd"/>
-                  <w:r>
-                    <w:rPr>
-                      <w:b/>
-                      <w:bCs/>
-                    </w:rPr>
-                    <w:t>:</w:t>
+                    <w:t>Contr:</w:t>
                   </w:r>
                 </w:p>
               </w:tc>
@@ -498,7 +489,11 @@
                     <w:right w:val="single" w:sz="6" w:space="0" w:color="000000"/>
                   </w:tcBorders>
                 </w:tcPr>
-                <w:p/>
+                <w:p>
+                  <w:r>
+                    <w:t xml:space="preserve"> {{SUBMITTAL_NUMBER}}</w:t>
+                  </w:r>
+                </w:p>
               </w:tc>
             </w:tr>
             <w:tr>
@@ -619,14 +614,7 @@
                       <w:b/>
                       <w:bCs/>
                     </w:rPr>
-                    <w:t>Project</w:t>
-                  </w:r>
-                  <w:r>
-                    <w:rPr>
-                      <w:b/>
-                      <w:bCs/>
-                    </w:rPr>
-                    <w:t>:</w:t>
+                    <w:t>Project:</w:t>
                   </w:r>
                 </w:p>
               </w:tc>
@@ -879,11 +867,9 @@
       </w:pPr>
     </w:p>
     <w:p>
-      <w:proofErr w:type="spellStart"/>
       <w:r>
         <w:t>SJCDProject</w:t>
       </w:r>
-      <w:proofErr w:type="spellEnd"/>
       <w:r>
         <w:t>:</w:t>
       </w:r>
@@ -899,18 +885,10 @@
         <w:t>PSCC Project No</w:t>
       </w:r>
       <w:r>
-        <w:t>.</w:t>
-      </w:r>
-      <w:proofErr w:type="gramStart"/>
-      <w:r>
-        <w:t>:</w:t>
+        <w:t>.:</w:t>
       </w:r>
       <w:r>
-        <w:t xml:space="preserve">  {</w:t>
-      </w:r>
-      <w:proofErr w:type="gramEnd"/>
-      <w:r>
-        <w:t>{PSCC_JOB_NO}}</w:t>
+        <w:t xml:space="preserve">  {{PSCC_JOB_NO}}</w:t>
       </w:r>
     </w:p>
     <w:tbl>
@@ -1875,23 +1853,7 @@
                 <w:sz w:val="14"/>
                 <w:szCs w:val="14"/>
               </w:rPr>
-              <w:t xml:space="preserve"> </w:t>
-            </w:r>
-            <w:proofErr w:type="gramStart"/>
-            <w:r>
-              <w:rPr>
-                <w:sz w:val="14"/>
-                <w:szCs w:val="14"/>
-              </w:rPr>
-              <w:t>AAN  APPROVED</w:t>
-            </w:r>
-            <w:proofErr w:type="gramEnd"/>
-            <w:r>
-              <w:rPr>
-                <w:sz w:val="14"/>
-                <w:szCs w:val="14"/>
-              </w:rPr>
-              <w:t xml:space="preserve"> AS NOTED</w:t>
+              <w:t xml:space="preserve"> AAN  APPROVED AS NOTED</w:t>
             </w:r>
           </w:p>
           <w:p>
@@ -2291,13 +2253,8 @@
             </w:tcBorders>
           </w:tcPr>
           <w:p>
-            <w:proofErr w:type="gramStart"/>
             <w:r>
-              <w:t>ENGINEERS</w:t>
-            </w:r>
-            <w:proofErr w:type="gramEnd"/>
-            <w:r>
-              <w:t xml:space="preserve"> COMMENTS:</w:t>
+              <w:t>ENGINEERS COMMENTS:</w:t>
             </w:r>
           </w:p>
         </w:tc>

</xml_diff>